<commit_message>
Lab1: use real political map (CIA World Factbook, public domain) for task6 poly area
</commit_message>
<xml_diff>
--- a/lab1/Отчет_Лабораторная_работа_1_Суранбаев_Байтур.docx
+++ b/lab1/Отчет_Лабораторная_работа_1_Суранбаев_Байтур.docx
@@ -718,13 +718,13 @@
         <w:br/>
         <w:t>&lt;h1&gt;Задание 6&lt;/h1&gt;</w:t>
         <w:br/>
-        <w:t>&lt;p&gt;Область Кыргызстана сделана с помощью shape="poly". Переход не выполняется, используется nohref.&lt;/p&gt;</w:t>
+        <w:t>&lt;p&gt;Область Кыргызстана сделана с помощью shape="poly" по контуру реальной политической карты (источник: CIA World Factbook, Wikimedia Commons, общественное достояние). Переход не выполняется, используется nohref.&lt;/p&gt;</w:t>
         <w:br/>
-        <w:t>&lt;img src="images/map.jpg" width="900" height="500" alt="Карта" usemap="#country"&gt;</w:t>
+        <w:t>&lt;img src="images/map.jpg" width="900" height="456" alt="Политическая карта Кыргызстана" usemap="#country"&gt;</w:t>
         <w:br/>
         <w:t>&lt;map name="country"&gt;</w:t>
         <w:br/>
-        <w:t>&lt;area shape="poly" coords="170,290,240,230,330,250,400,205,500,225,570,185,680,220,760,190,820,240,770,300,820,340,740,360,680,410,570,380,500,420,400,390,320,410,240,365,190,370" nohref title="Кыргызстан" alt="Кыргызстан"&gt;</w:t>
+        <w:t>&lt;area shape="poly" coords="876,127,739,54,500,65,397,26,355,97,202,65,161,111,179,132,104,188,172,227,229,205,311,282,237,328,43,336,23,388,198,392,255,429,377,408,392,348,525,293,530,321,580,314,618,246,714,240,756,188" nohref title="Кыргызстан" alt="Кыргызстан"&gt;</w:t>
         <w:br/>
         <w:t>&lt;/map&gt;</w:t>
         <w:br/>

</xml_diff>

<commit_message>
Lab1: task1 now uses correct sample content (poem, not airline theme)
</commit_message>
<xml_diff>
--- a/lab1/Отчет_Лабораторная_работа_1_Суранбаев_Байтур.docx
+++ b/lab1/Отчет_Лабораторная_работа_1_Суранбаев_Байтур.docx
@@ -210,7 +210,7 @@
     </w:p>
     <w:p>
       <w:r>
-        <w:t>Создан task1.html. Записана базовая структура HTML. Добавлены hr, h1, h2, h3–h6, p, q, blockquote, b, em, u, i и font. Для линии изменены толщина, длина, цвет и выравнивание. ФИО автора подчеркнуто и расположено справа.</w:t>
+        <w:t>Создан task1.html по образцу (рис. 1.1): базовая структура HTML со стихотворением («Евгений Онегин», А.С. Пушкин, отрывок). Название стихотворения оформлено с отступом (красная строка) и заключено в кавычки тегом q. Для горизонтальной линии hr изменены толщина, длина, цвет и выравнивание по центру. Использованы h1, h2, p, b, em, i, blockquote. ФИО автора лабораторной работы оформлено тегом font: подчёркнуто (u), с тенью текста и выравниванием справа.</w:t>
       </w:r>
     </w:p>
     <w:p>
@@ -362,29 +362,42 @@
         <w:br/>
         <w:t>&lt;head&gt;</w:t>
         <w:br/>
-        <w:t>&lt;title&gt;Задание 1 - Авиакасса&lt;/title&gt;</w:t>
+        <w:t>&lt;title&gt;Мой первый HTML-документ&lt;/title&gt;</w:t>
         <w:br/>
         <w:t>&lt;/head&gt;</w:t>
         <w:br/>
         <w:t>&lt;body&gt;</w:t>
         <w:br/>
-        <w:t>&lt;h1 align="center"&gt;Задание 1&lt;/h1&gt;</w:t>
+        <w:t>&lt;h1&gt;Мой первый HTML-документ&lt;/h1&gt;</w:t>
         <w:br/>
         <w:t>&lt;hr size="5" width="60%" color="blue" align="center"&gt;</w:t>
         <w:br/>
-        <w:t>&lt;p style="text-indent:40px;"&gt;&lt;q&gt;Самолёт&lt;/q&gt; — быстрый путь к новым путешествиям.&lt;/p&gt;</w:t>
+        <w:t>&lt;h2 style="text-indent:40px;"&gt;&lt;q&gt;Евгений Онегин&lt;/q&gt;&lt;/h2&gt;</w:t>
         <w:br/>
-        <w:t>&lt;p align="center"&gt;&lt;b&gt;Авиапутешествие&lt;/b&gt;&lt;/p&gt;</w:t>
+        <w:t>&lt;p&gt;&lt;b&gt;А.С. Пушкин&lt;/b&gt; &lt;em&gt;(отрывок)&lt;/em&gt;&lt;/p&gt;</w:t>
         <w:br/>
-        <w:t>&lt;blockquote&gt;&lt;em&gt;Путешествие начинается с покупки билета.&lt;/em&gt;&lt;/blockquote&gt;</w:t>
+        <w:t>&lt;p&gt;</w:t>
         <w:br/>
-        <w:t>&lt;p align="right"&gt;&lt;font face="Arial" size="4" color="blue"&gt;&lt;u&gt;&lt;i&gt;Суранбаев Байтур&lt;/i&gt;&lt;/u&gt;&lt;/font&gt;&lt;/p&gt;</w:t>
+        <w:t>Мой дядя самых честных правил,&lt;br&gt;</w:t>
         <w:br/>
-        <w:t>&lt;p align="right"&gt;&lt;font face="Arial" size="3" color="black"&gt;&lt;span style="text-shadow:2px 2px 2px gray;"&gt;Автор лабораторной работы&lt;/span&gt;&lt;/font&gt;&lt;/p&gt;</w:t>
+        <w:t>Когда не в шутку занемог,&lt;br&gt;</w:t>
+        <w:br/>
+        <w:t>Он уважать себя заставил&lt;br&gt;</w:t>
+        <w:br/>
+        <w:t>И лучше выдумать не мог.</w:t>
+        <w:br/>
+        <w:t>&lt;/p&gt;</w:t>
+        <w:br/>
+        <w:t>&lt;blockquote&gt;&lt;i&gt;Его пример другим наука...&lt;/i&gt;&lt;/blockquote&gt;</w:t>
+        <w:br/>
+        <w:t>&lt;p align="right"&gt;&lt;font face="Arial" size="4" color="black"&gt;&lt;u&gt;&lt;span style="text-shadow:2px 2px 2px gray;"&gt;Суранбаев Байтур&lt;/span&gt;&lt;/u&gt;&lt;/font&gt;&lt;/p&gt;</w:t>
+        <w:br/>
+        <w:t>&lt;p align="right"&gt;&lt;font face="Arial" size="3" color="black"&gt;Автор лабораторной работы, группа ИВТ 1-25&lt;/font&gt;&lt;/p&gt;</w:t>
         <w:br/>
         <w:t>&lt;/body&gt;</w:t>
         <w:br/>
         <w:t>&lt;/html&gt;</w:t>
+        <w:br/>
       </w:r>
     </w:p>
     <w:p>

</xml_diff>

<commit_message>
Lab1: rebuild task2 (О себе with Число + подпись) and task3 (visitka layout per sample)
</commit_message>
<xml_diff>
--- a/lab1/Отчет_Лабораторная_работа_1_Суранбаев_Байтур.docx
+++ b/lab1/Отчет_Лабораторная_работа_1_Суранбаев_Байтур.docx
@@ -228,7 +228,7 @@
     </w:p>
     <w:p>
       <w:r>
-        <w:t>Создан task2.html. В title записано «Об авторе». В body применены bgcolor, background, text и link. Добавлен эпиграф с q. Созданы нумерованный и маркированный списки. Добавлена ссылка на визитку.</w:t>
+        <w:t>Создан task2.html по образцу (рис. 1.2): в title указано «Об авторе». В body применены bgcolor, background, text и link. Добавлены разделы «Эпиграф» (цитата в тег q), краткий рассказ о себе с разными шрифтами и цветными словами (font size/color/face), раздел «Число» и подпись в виде графического файла (img). Составлены нумерованный и маркированный списки, добавлена ссылка на визитку.</w:t>
       </w:r>
     </w:p>
     <w:p>
@@ -246,7 +246,7 @@
     </w:p>
     <w:p>
       <w:r>
-        <w:t>Создан task3.html по тематике «Авиакасса». Использованы h1–h6, p/div, pre, blockquote, специальные символы, font с size/color/face, u/i/s/sup/sub и address.</w:t>
+        <w:t>Создан task3.html по образцу (рис. 1.2, аналог сайта В. Высоцкого) на тему «Авиакасса»: заголовок сайта (h1, font color), строки статуса сайта (u, i), раздел «Разработчики сайта» с пометками через sup и зачёркнутым именем (s), разделы «Цель сайта» и «Целевая аудитория сайта», статистика «Число проданных билетов» в теге pre, а также h1–h6, p/div, blockquote-подобные элементы, специальные символы, font с size/color/face, u/i/s/sup/sub и тег address с копирайтом ©.</w:t>
       </w:r>
     </w:p>
     <w:p>
@@ -410,7 +410,57 @@
         <w:pStyle w:val="Heading2"/>
       </w:pPr>
       <w:r>
-        <w:t>task2.html</w:t>
+        <w:t>&lt;!DOCTYPE html&gt;</w:t>
+        <w:br/>
+        <w:t>&lt;html&gt;</w:t>
+        <w:br/>
+        <w:t>&lt;head&gt;&lt;title&gt;Об авторе&lt;/title&gt;&lt;/head&gt;</w:t>
+        <w:br/>
+        <w:t>&lt;body bgcolor="lightblue" background="images/background.jpg" text="black" link="blue"&gt;</w:t>
+        <w:br/>
+        <w:t>&lt;h1 align="center"&gt;Об авторе&lt;/h1&gt;</w:t>
+        <w:br/>
+        <w:br/>
+        <w:t>&lt;h3&gt;Эпиграф&lt;/h3&gt;</w:t>
+        <w:br/>
+        <w:t>&lt;p align="center"&gt;&lt;q&gt;Путешествие начинается с первого шага.&lt;/q&gt;&lt;/p&gt;</w:t>
+        <w:br/>
+        <w:br/>
+        <w:t>&lt;p&gt;Меня зовут &lt;font face="Arial" size="4" color="blue"&gt;&lt;b&gt;Суранбаев Байтур&lt;/b&gt;&lt;/font&gt;, я студент группы</w:t>
+        <w:br/>
+        <w:t>&lt;font face="Arial" size="3" color="green"&gt;ИВТ 1-25&lt;/font&gt;. В этой лабораторной работе изучаю HTML и</w:t>
+        <w:br/>
+        <w:t>создаю учебный сайт на тему &lt;font face="Times New Roman" size="3" color="red"&gt;&lt;i&gt;«Авиакасса»&lt;/i&gt;&lt;/font&gt;.</w:t>
+        <w:br/>
+        <w:t>Увлекаюсь &lt;font color="purple"&gt;авиацией&lt;/font&gt; и информационными технологиями.&lt;/p&gt;</w:t>
+        <w:br/>
+        <w:br/>
+        <w:t>&lt;h3&gt;Число&lt;/h3&gt;</w:t>
+        <w:br/>
+        <w:t>&lt;p&gt;Группа: &lt;b&gt;ИВТ 1-25&lt;/b&gt;, курс: &lt;b&gt;1&lt;/b&gt;&lt;/p&gt;</w:t>
+        <w:br/>
+        <w:br/>
+        <w:t>&lt;h2&gt;Мои интересы&lt;/h2&gt;</w:t>
+        <w:br/>
+        <w:t>&lt;ul&gt;&lt;li&gt;авиация&lt;/li&gt;&lt;li&gt;путешествия&lt;/li&gt;&lt;li&gt;информационные технологии&lt;/li&gt;&lt;/ul&gt;</w:t>
+        <w:br/>
+        <w:br/>
+        <w:t>&lt;h2&gt;Что я изучаю&lt;/h2&gt;</w:t>
+        <w:br/>
+        <w:t>&lt;ol&gt;&lt;li&gt;HTML&lt;/li&gt;&lt;li&gt;гиперссылки&lt;/li&gt;&lt;li&gt;изображения&lt;/li&gt;&lt;/ol&gt;</w:t>
+        <w:br/>
+        <w:br/>
+        <w:t>&lt;p&gt;Что-то вроде подписи в виде графического файла:&lt;/p&gt;</w:t>
+        <w:br/>
+        <w:t>&lt;p&gt;&lt;img src="images/signature.png" width="200" alt="Подпись автора"&gt;&lt;/p&gt;</w:t>
+        <w:br/>
+        <w:br/>
+        <w:t>&lt;p&gt;&lt;a href="task3.html"&gt;Перейти к визитке сайта&lt;/a&gt;&lt;/p&gt;</w:t>
+        <w:br/>
+        <w:t>&lt;/body&gt;</w:t>
+        <w:br/>
+        <w:t>&lt;/html&gt;</w:t>
+        <w:br/>
       </w:r>
     </w:p>
     <w:p>
@@ -460,7 +510,100 @@
         <w:pStyle w:val="Heading2"/>
       </w:pPr>
       <w:r>
-        <w:t>task3.html</w:t>
+        <w:t>&lt;!DOCTYPE html&gt;</w:t>
+        <w:br/>
+        <w:t>&lt;html&gt;</w:t>
+        <w:br/>
+        <w:t>&lt;head&gt;&lt;title&gt;Авиакасса «AIRLINE KG» — визитка сайта&lt;/title&gt;&lt;/head&gt;</w:t>
+        <w:br/>
+        <w:t>&lt;body&gt;</w:t>
+        <w:br/>
+        <w:br/>
+        <w:t>&lt;h1&gt;&lt;font color="red"&gt;Сайт авиакассы «AIRLINE KG»&lt;/font&gt;&lt;/h1&gt;</w:t>
+        <w:br/>
+        <w:br/>
+        <w:t>&lt;div align="center"&gt;</w:t>
+        <w:br/>
+        <w:t>&lt;p&gt;&lt;i&gt;&lt;u&gt;Сайт находится в разработке.&lt;/u&gt;&lt;/i&gt;&lt;/p&gt;</w:t>
+        <w:br/>
+        <w:t>&lt;p&gt;&lt;i&gt;&lt;u&gt;Открытие сайта состоится 1 ноября 2026 года.&lt;/u&gt;&lt;/i&gt;&lt;/p&gt;</w:t>
+        <w:br/>
+        <w:t>&lt;/div&gt;</w:t>
+        <w:br/>
+        <w:br/>
+        <w:t>&lt;h3&gt;Разработчики сайта&lt;/h3&gt;</w:t>
+        <w:br/>
+        <w:t>&lt;p&gt;</w:t>
+        <w:br/>
+        <w:t>Суранбаев Байтур&lt;sup&gt;Автор/Верстальщик&lt;/sup&gt;&lt;br&gt;</w:t>
+        <w:br/>
+        <w:t>Эркинбек А.&lt;sup&gt;Преподаватель&lt;/sup&gt;&lt;br&gt;</w:t>
+        <w:br/>
+        <w:t>&lt;s&gt;Петров Пётр Петрович&lt;/s&gt;</w:t>
+        <w:br/>
+        <w:t>&lt;/p&gt;</w:t>
+        <w:br/>
+        <w:br/>
+        <w:t>&lt;h3&gt;Цель сайта&lt;/h3&gt;</w:t>
+        <w:br/>
+        <w:t>&lt;p&gt;Цель создания сайта — предоставить пассажирам удобный способ подобрать авиарейс,</w:t>
+        <w:br/>
+        <w:t>сравнить направления и оформить покупку авиабилета онлайн, не выходя из дома.&lt;/p&gt;</w:t>
+        <w:br/>
+        <w:br/>
+        <w:t>&lt;h3&gt;Целевая аудитория сайта&lt;/h3&gt;</w:t>
+        <w:br/>
+        <w:t>&lt;p&gt;Основными посетителями сайта являются пассажиры, планирующие авиаперелёты по Кыргызстану</w:t>
+        <w:br/>
+        <w:t>и за рубеж: туристы, командированные сотрудники, студенты и все, кому нужно быстро и</w:t>
+        <w:br/>
+        <w:t>недорого купить авиабилет.&lt;/p&gt;</w:t>
+        <w:br/>
+        <w:br/>
+        <w:t>&lt;h4&gt;Число проданных билетов&lt;/h4&gt;</w:t>
+        <w:br/>
+        <w:t>&lt;pre&gt;</w:t>
+        <w:br/>
+        <w:t>- - - - - - - -</w:t>
+        <w:br/>
+        <w:t>2023:   540</w:t>
+        <w:br/>
+        <w:t>2024:  1120</w:t>
+        <w:br/>
+        <w:t>2025:  2385</w:t>
+        <w:br/>
+        <w:t>&lt;/pre&gt;</w:t>
+        <w:br/>
+        <w:br/>
+        <w:t>&lt;h5&gt;Направления&lt;/h5&gt;</w:t>
+        <w:br/>
+        <w:t>&lt;div&gt;&lt;font size="5" color="blue" face="Arial"&gt;Быстрый поиск авиабилетов&lt;/font&gt;&lt;/div&gt;</w:t>
+        <w:br/>
+        <w:t>&lt;pre&gt;Маршрут: Бишкек - Стамбул</w:t>
+        <w:br/>
+        <w:t>Класс: Эконом</w:t>
+        <w:br/>
+        <w:t>Багаж: 20 кг&lt;/pre&gt;</w:t>
+        <w:br/>
+        <w:br/>
+        <w:t>&lt;h6&gt;Учебный сайт&lt;/h6&gt;</w:t>
+        <w:br/>
+        <w:t>&lt;p&gt;&lt;u&gt;Удобный выбор&lt;/u&gt;, &lt;i&gt;простое оформление&lt;/i&gt;, &lt;s&gt;без лишних сложностей&lt;/s&gt;.&lt;/p&gt;</w:t>
+        <w:br/>
+        <w:t>&lt;p&gt;Стоимость&lt;sup&gt;*&lt;/sup&gt; и данные пассажира&lt;sub&gt;1&lt;/sub&gt;.&lt;/p&gt;</w:t>
+        <w:br/>
+        <w:t>&lt;p&gt;Специальные символы: &amp;copy; &amp;amp; &amp;lt; &amp;gt; &amp;rarr;&lt;/p&gt;</w:t>
+        <w:br/>
+        <w:br/>
+        <w:t>&lt;p&gt;&amp;copy; 2024–2026 Учебный проект «Авиакасса AIRLINE KG»&lt;/p&gt;</w:t>
+        <w:br/>
+        <w:t>&lt;address&gt;Суранбаев Байтур&lt;br&gt;Группа ИВТ 1-25&lt;br&gt;Кыргызстан, г. Бишкек&lt;/address&gt;</w:t>
+        <w:br/>
+        <w:br/>
+        <w:t>&lt;/body&gt;</w:t>
+        <w:br/>
+        <w:t>&lt;/html&gt;</w:t>
+        <w:br/>
       </w:r>
     </w:p>
     <w:p>

</xml_diff>